<commit_message>
docs(bridge): fix handover doc — raw OOXML showing for option headers
The Option A/B/C header paragraphs passed pre-built run XML into a text
helper, so Word rendered the literal <w:r> markup. Build them with para()
instead. Regenerated.

Co-Authored-By: Claude Opus 4.8 <noreply@anthropic.com>
</commit_message>
<xml_diff>
--- a/sql-account-bridge/SQL-Account-Integration-Handover.docx
+++ b/sql-account-bridge/SQL-Account-Integration-Handover.docx
@@ -57,11 +57,22 @@
       <w:r>
         <w:rPr>
           <w:rFonts w:ascii="Arial" w:hAnsi="Arial"/>
-          <w:sz w:val="20"/>
-          <w:szCs w:val="20"/>
-          <w:color w:val="000000"/>
-        </w:rPr>
-        <w:t xml:space="preserve">&lt;w:r&gt;&lt;w:rPr&gt;&lt;w:rFonts w:ascii="Arial" w:hAnsi="Arial"/&gt;&lt;w:b/&gt;&lt;w:sz w:val="21"/&gt;&lt;w:szCs w:val="21"/&gt;&lt;w:color w:val="000000"/&gt;&lt;/w:rPr&gt;&lt;w:t xml:space="preserve"&gt;Option A — CSV export   &lt;/w:t&gt;&lt;/w:r&gt;&lt;w:r&gt;&lt;w:rPr&gt;&lt;w:rFonts w:ascii="Arial" w:hAnsi="Arial"/&gt;&lt;w:i/&gt;&lt;w:sz w:val="19"/&gt;&lt;w:szCs w:val="19"/&gt;&lt;w:color w:val="555555"/&gt;&lt;/w:rPr&gt;&lt;w:t xml:space="preserve"&gt;(easiest — live the fastest)&lt;/w:t&gt;&lt;/w:r&gt;</w:t>
+          <w:b/>
+          <w:sz w:val="21"/>
+          <w:szCs w:val="21"/>
+          <w:color w:val="000000"/>
+        </w:rPr>
+        <w:t xml:space="preserve">Option A — CSV export</w:t>
+      </w:r>
+      <w:r>
+        <w:rPr>
+          <w:rFonts w:ascii="Arial" w:hAnsi="Arial"/>
+          <w:i/>
+          <w:sz w:val="19"/>
+          <w:szCs w:val="19"/>
+          <w:color w:val="555555"/>
+        </w:rPr>
+        <w:t xml:space="preserve">   (easiest — live the fastest)</w:t>
       </w:r>
     </w:p>
     <w:p>
@@ -100,7 +111,7 @@
           <w:szCs w:val="20"/>
           <w:color w:val="000000"/>
         </w:rPr>
-        <w:t xml:space="preserve">Document No</w:t>
+        <w:t xml:space="preserve">Document No </w:t>
       </w:r>
       <w:r>
         <w:rPr>
@@ -134,7 +145,7 @@
           <w:szCs w:val="20"/>
           <w:color w:val="000000"/>
         </w:rPr>
-        <w:t xml:space="preserve">Customer name</w:t>
+        <w:t xml:space="preserve">Customer name </w:t>
       </w:r>
       <w:r>
         <w:rPr>
@@ -271,11 +282,22 @@
       <w:r>
         <w:rPr>
           <w:rFonts w:ascii="Arial" w:hAnsi="Arial"/>
-          <w:sz w:val="20"/>
-          <w:szCs w:val="20"/>
-          <w:color w:val="000000"/>
-        </w:rPr>
-        <w:t xml:space="preserve">&lt;w:r&gt;&lt;w:rPr&gt;&lt;w:rFonts w:ascii="Arial" w:hAnsi="Arial"/&gt;&lt;w:b/&gt;&lt;w:sz w:val="21"/&gt;&lt;w:szCs w:val="21"/&gt;&lt;w:color w:val="000000"/&gt;&lt;/w:rPr&gt;&lt;w:t xml:space="preserve"&gt;Option B — Firebird database   &lt;/w:t&gt;&lt;/w:r&gt;&lt;w:r&gt;&lt;w:rPr&gt;&lt;w:rFonts w:ascii="Arial" w:hAnsi="Arial"/&gt;&lt;w:i/&gt;&lt;w:sz w:val="19"/&gt;&lt;w:szCs w:val="19"/&gt;&lt;w:color w:val="555555"/&gt;&lt;/w:rPr&gt;&lt;w:t xml:space="preserve"&gt;(direct — fully hands-free)&lt;/w:t&gt;&lt;/w:r&gt;</w:t>
+          <w:b/>
+          <w:sz w:val="21"/>
+          <w:szCs w:val="21"/>
+          <w:color w:val="000000"/>
+        </w:rPr>
+        <w:t xml:space="preserve">Option B — Firebird database</w:t>
+      </w:r>
+      <w:r>
+        <w:rPr>
+          <w:rFonts w:ascii="Arial" w:hAnsi="Arial"/>
+          <w:i/>
+          <w:sz w:val="19"/>
+          <w:szCs w:val="19"/>
+          <w:color w:val="555555"/>
+        </w:rPr>
+        <w:t xml:space="preserve">   (direct — fully hands-free)</w:t>
       </w:r>
     </w:p>
     <w:p>
@@ -357,11 +379,22 @@
       <w:r>
         <w:rPr>
           <w:rFonts w:ascii="Arial" w:hAnsi="Arial"/>
-          <w:sz w:val="20"/>
-          <w:szCs w:val="20"/>
-          <w:color w:val="000000"/>
-        </w:rPr>
-        <w:t xml:space="preserve">&lt;w:r&gt;&lt;w:rPr&gt;&lt;w:rFonts w:ascii="Arial" w:hAnsi="Arial"/&gt;&lt;w:b/&gt;&lt;w:sz w:val="21"/&gt;&lt;w:szCs w:val="21"/&gt;&lt;w:color w:val="000000"/&gt;&lt;/w:rPr&gt;&lt;w:t xml:space="preserve"&gt;Option C — SQL Account SDK   &lt;/w:t&gt;&lt;/w:r&gt;&lt;w:r&gt;&lt;w:rPr&gt;&lt;w:rFonts w:ascii="Arial" w:hAnsi="Arial"/&gt;&lt;w:i/&gt;&lt;w:sz w:val="19"/&gt;&lt;w:szCs w:val="19"/&gt;&lt;w:color w:val="555555"/&gt;&lt;/w:rPr&gt;&lt;w:t xml:space="preserve"&gt;(direct — fully hands-free)&lt;/w:t&gt;&lt;/w:r&gt;</w:t>
+          <w:b/>
+          <w:sz w:val="21"/>
+          <w:szCs w:val="21"/>
+          <w:color w:val="000000"/>
+        </w:rPr>
+        <w:t xml:space="preserve">Option C — SQL Account SDK</w:t>
+      </w:r>
+      <w:r>
+        <w:rPr>
+          <w:rFonts w:ascii="Arial" w:hAnsi="Arial"/>
+          <w:i/>
+          <w:sz w:val="19"/>
+          <w:szCs w:val="19"/>
+          <w:color w:val="555555"/>
+        </w:rPr>
+        <w:t xml:space="preserve">   (direct — fully hands-free)</w:t>
       </w:r>
     </w:p>
     <w:p>

</xml_diff>